<commit_message>
docs: regenerate the VMO2 guide docx after the archive-size correction
Co-Authored-By: Claude Opus 5 (1M context) <noreply@anthropic.com>
</commit_message>
<xml_diff>
--- a/Magpie-VMO2-GitLab-deployment-guide.docx
+++ b/Magpie-VMO2-GitLab-deployment-guide.docx
@@ -1461,7 +1461,7 @@
         <w:pStyle w:val="FirstParagraph"/>
       </w:pPr>
       <w:r>
-        <w:t xml:space="preserve">Roughly 50 MB of source, of which 24 MB is</w:t>
+        <w:t xml:space="preserve">About 55 MB zipped, 890 files. Half of it is material rather than code: 24 MB</w:t>
       </w:r>
       <w:r>
         <w:t xml:space="preserve"> </w:t>
@@ -1476,7 +1476,7 @@
         <w:t xml:space="preserve"> </w:t>
       </w:r>
       <w:r>
-        <w:t xml:space="preserve">and 24 MB is</w:t>
+        <w:t xml:space="preserve">and 24 MB</w:t>
       </w:r>
       <w:r>
         <w:t xml:space="preserve"> </w:t>

</xml_diff>

<commit_message>
docs(handover): front matter naming what was sent and what is absent
One document rather than two: a separate "start here" would duplicate the setup
path and drift from it. The guide now opens with what arrived, how to check it,
the four things deliberately absent and where each is dealt with, and rough
timings — so it stands on its own beside the bundle without a second file to
keep in step.

Co-Authored-By: Claude Opus 5 (1M context) <noreply@anthropic.com>
</commit_message>
<xml_diff>
--- a/Magpie-VMO2-GitLab-deployment-guide.docx
+++ b/Magpie-VMO2-GitLab-deployment-guide.docx
@@ -28,7 +28,7 @@
         </w:p>
       </w:sdtContent>
     </w:sdt>
-    <w:bookmarkStart w:id="39" w:name="X4ba981f863484a2d71c4b4356a1843fca903540"/>
+    <w:bookmarkStart w:id="42" w:name="X4ba981f863484a2d71c4b4356a1843fca903540"/>
     <w:p>
       <w:pPr>
         <w:pStyle w:val="Heading1"/>
@@ -42,7 +42,7 @@
         <w:pStyle w:val="FirstParagraph"/>
       </w:pPr>
       <w:r>
-        <w:t xml:space="preserve">A single path to follow, in order, from the zip on your personal machine to a</w:t>
+        <w:t xml:space="preserve">A single path to follow, in order, from the archive on your personal machine to a</w:t>
       </w:r>
       <w:r>
         <w:t xml:space="preserve"> </w:t>
@@ -126,13 +126,13 @@
         </w:pict>
       </w:r>
     </w:p>
-    <w:bookmarkStart w:id="9" w:name="what-to-ask-vmo2-first"/>
+    <w:bookmarkStart w:id="11" w:name="before-you-begin-what-you-were-sent"/>
     <w:p>
       <w:pPr>
         <w:pStyle w:val="Heading2"/>
       </w:pPr>
       <w:r>
-        <w:t xml:space="preserve">0 · What to ask VMO2 first</w:t>
+        <w:t xml:space="preserve">Before you begin — what you were sent</w:t>
       </w:r>
     </w:p>
     <w:p>
@@ -140,13 +140,190 @@
         <w:pStyle w:val="FirstParagraph"/>
       </w:pPr>
       <w:r>
-        <w:t xml:space="preserve">None of this is work. It is five questions, and the answers change the shape of</w:t>
-      </w:r>
-      <w:r>
-        <w:t xml:space="preserve"> </w:t>
-      </w:r>
-      <w:r>
-        <w:t xml:space="preserve">what follows. Ask them all in one message, on the same day you start.</w:t>
+        <w:t xml:space="preserve">Two things travel together. Keep this document</w:t>
+      </w:r>
+      <w:r>
+        <w:t xml:space="preserve"> </w:t>
+      </w:r>
+      <w:r>
+        <w:rPr>
+          <w:i/>
+          <w:iCs/>
+        </w:rPr>
+        <w:t xml:space="preserve">outside</w:t>
+      </w:r>
+      <w:r>
+        <w:t xml:space="preserve"> </w:t>
+      </w:r>
+      <w:r>
+        <w:t xml:space="preserve">the archive: it tells you</w:t>
+      </w:r>
+      <w:r>
+        <w:t xml:space="preserve"> </w:t>
+      </w:r>
+      <w:r>
+        <w:t xml:space="preserve">how to open the archive, so it is no use to you inside it.</w:t>
+      </w:r>
+    </w:p>
+    <w:tbl>
+      <w:tblPr>
+        <w:tblStyle w:val="Table"/>
+        <w:tblW w:type="pct" w:w="5000"/>
+        <w:tblLayout w:type="fixed"/>
+        <w:tblLook w:firstRow="0" w:lastRow="0" w:firstColumn="0" w:lastColumn="0" w:noHBand="0" w:noVBand="0" w:val="0000"/>
+      </w:tblPr>
+      <w:tblGrid>
+        <w:gridCol w:w="3960"/>
+        <w:gridCol w:w="3960"/>
+      </w:tblGrid>
+      <w:tr>
+        <w:tc>
+          <w:tcPr/>
+          <w:p>
+            <w:pPr>
+              <w:pStyle w:val="Compact"/>
+            </w:pPr>
+            <w:r>
+              <w:rPr>
+                <w:rStyle w:val="VerbatimChar"/>
+                <w:b/>
+                <w:bCs/>
+              </w:rPr>
+              <w:t xml:space="preserve">magpie-handover.bundle</w:t>
+            </w:r>
+          </w:p>
+        </w:tc>
+        <w:tc>
+          <w:tcPr/>
+          <w:p>
+            <w:pPr>
+              <w:pStyle w:val="Compact"/>
+            </w:pPr>
+            <w:r>
+              <w:t xml:space="preserve">~34 MB. The entire repository — source, infrastructure, pipeline, documentation and full commit history — as one file</w:t>
+            </w:r>
+          </w:p>
+        </w:tc>
+      </w:tr>
+      <w:tr>
+        <w:tc>
+          <w:tcPr/>
+          <w:p>
+            <w:pPr>
+              <w:pStyle w:val="Compact"/>
+            </w:pPr>
+            <w:r>
+              <w:rPr>
+                <w:b/>
+                <w:bCs/>
+              </w:rPr>
+              <w:t xml:space="preserve">This document</w:t>
+            </w:r>
+          </w:p>
+        </w:tc>
+        <w:tc>
+          <w:tcPr/>
+          <w:p>
+            <w:pPr>
+              <w:pStyle w:val="Compact"/>
+            </w:pPr>
+            <w:r>
+              <w:t xml:space="preserve">The setup path, start to finish</w:t>
+            </w:r>
+          </w:p>
+        </w:tc>
+      </w:tr>
+    </w:tbl>
+    <w:p>
+      <w:pPr>
+        <w:pStyle w:val="BodyText"/>
+      </w:pPr>
+      <w:r>
+        <w:t xml:space="preserve">A bundle is a git repository in a single file. You do not unzip it; you clone from</w:t>
+      </w:r>
+      <w:r>
+        <w:t xml:space="preserve"> </w:t>
+      </w:r>
+      <w:r>
+        <w:t xml:space="preserve">it, and what you get is an ordinary working repository with its history intact.</w:t>
+      </w:r>
+    </w:p>
+    <w:p>
+      <w:pPr>
+        <w:pStyle w:val="BodyText"/>
+      </w:pPr>
+      <w:r>
+        <w:rPr>
+          <w:b/>
+          <w:bCs/>
+        </w:rPr>
+        <w:t xml:space="preserve">First, check it arrived whole.</w:t>
+      </w:r>
+      <w:r>
+        <w:t xml:space="preserve"> </w:t>
+      </w:r>
+      <w:r>
+        <w:t xml:space="preserve">Compare against the checksum sent with the file:</w:t>
+      </w:r>
+    </w:p>
+    <w:p>
+      <w:pPr>
+        <w:pStyle w:val="SourceCode"/>
+      </w:pPr>
+      <w:r>
+        <w:rPr>
+          <w:rStyle w:val="ExtensionTok"/>
+        </w:rPr>
+        <w:t xml:space="preserve">shasum</w:t>
+      </w:r>
+      <w:r>
+        <w:rPr>
+          <w:rStyle w:val="NormalTok"/>
+        </w:rPr>
+        <w:t xml:space="preserve"> </w:t>
+      </w:r>
+      <w:r>
+        <w:rPr>
+          <w:rStyle w:val="AttributeTok"/>
+        </w:rPr>
+        <w:t xml:space="preserve">-a</w:t>
+      </w:r>
+      <w:r>
+        <w:rPr>
+          <w:rStyle w:val="NormalTok"/>
+        </w:rPr>
+        <w:t xml:space="preserve"> 256 magpie-handover.bundle</w:t>
+      </w:r>
+    </w:p>
+    <w:p>
+      <w:pPr>
+        <w:pStyle w:val="FirstParagraph"/>
+      </w:pPr>
+      <w:r>
+        <w:t xml:space="preserve">If it does not match, stop — copy it again rather than working from a damaged</w:t>
+      </w:r>
+      <w:r>
+        <w:t xml:space="preserve"> </w:t>
+      </w:r>
+      <w:r>
+        <w:t xml:space="preserve">archive.</w:t>
+      </w:r>
+    </w:p>
+    <w:bookmarkStart w:id="9" w:name="what-is-not-in-it-and-never-was"/>
+    <w:p>
+      <w:pPr>
+        <w:pStyle w:val="Heading3"/>
+      </w:pPr>
+      <w:r>
+        <w:t xml:space="preserve">What is not in it, and never was</w:t>
+      </w:r>
+    </w:p>
+    <w:p>
+      <w:pPr>
+        <w:pStyle w:val="FirstParagraph"/>
+      </w:pPr>
+      <w:r>
+        <w:t xml:space="preserve">Four things are deliberately absent, and none is an oversight:</w:t>
       </w:r>
     </w:p>
     <w:tbl>
@@ -172,7 +349,7 @@
               <w:pStyle w:val="Compact"/>
             </w:pPr>
             <w:r>
-              <w:t xml:space="preserve">Question</w:t>
+              <w:t xml:space="preserve">Missing</w:t>
             </w:r>
           </w:p>
         </w:tc>
@@ -183,7 +360,7 @@
               <w:pStyle w:val="Compact"/>
             </w:pPr>
             <w:r>
-              <w:t xml:space="preserve">Why it matters</w:t>
+              <w:t xml:space="preserve">Why</w:t>
             </w:r>
           </w:p>
         </w:tc>
@@ -194,7 +371,7 @@
               <w:pStyle w:val="Compact"/>
             </w:pPr>
             <w:r>
-              <w:t xml:space="preserve">If the answer is not the easy one</w:t>
+              <w:t xml:space="preserve">Where it is dealt with</w:t>
             </w:r>
           </w:p>
         </w:tc>
@@ -208,10 +385,9 @@
             </w:pPr>
             <w:r>
               <w:rPr>
-                <w:b/>
-                <w:bCs/>
+                <w:rStyle w:val="VerbatimChar"/>
               </w:rPr>
-              <w:t xml:space="preserve">Will you permit Workload Identity Federation from GitLab to GCP?</w:t>
+              <w:t xml:space="preserve">.env</w:t>
             </w:r>
           </w:p>
         </w:tc>
@@ -222,7 +398,7 @@
               <w:pStyle w:val="Compact"/>
             </w:pPr>
             <w:r>
-              <w:t xml:space="preserve">It is how the pipeline authenticates without a permanent key</w:t>
+              <w:t xml:space="preserve">Contains live API keys, the console password and the session secret</w:t>
             </w:r>
           </w:p>
         </w:tc>
@@ -233,7 +409,7 @@
               <w:pStyle w:val="Compact"/>
             </w:pPr>
             <w:r>
-              <w:t xml:space="preserve">The fallback is a service account JSON key in a CI variable. Most security teams refuse it. If they do, WIF is not optional and you wait for it</w:t>
+              <w:t xml:space="preserve">§11 — reissue under VMO2’s own accounts</w:t>
             </w:r>
           </w:p>
         </w:tc>
@@ -247,39 +423,9 @@
             </w:pPr>
             <w:r>
               <w:rPr>
-                <w:b/>
-                <w:bCs/>
+                <w:rStyle w:val="VerbatimChar"/>
               </w:rPr>
-              <w:t xml:space="preserve">Will you permit an</w:t>
-            </w:r>
-            <w:r>
-              <w:rPr>
-                <w:b/>
-                <w:bCs/>
-              </w:rPr>
-              <w:t xml:space="preserve"> </w:t>
-            </w:r>
-            <w:r>
-              <w:rPr>
-                <w:rStyle w:val="VerbatimChar"/>
-                <w:b/>
-                <w:bCs/>
-              </w:rPr>
-              <w:t xml:space="preserve">allUsers</w:t>
-            </w:r>
-            <w:r>
-              <w:rPr>
-                <w:b/>
-                <w:bCs/>
-              </w:rPr>
-              <w:t xml:space="preserve"> </w:t>
-            </w:r>
-            <w:r>
-              <w:rPr>
-                <w:b/>
-                <w:bCs/>
-              </w:rPr>
-              <w:t xml:space="preserve">invoker binding on Cloud Run?</w:t>
+              <w:t xml:space="preserve">envs/univelcity.*</w:t>
             </w:r>
           </w:p>
         </w:tc>
@@ -290,7 +436,7 @@
               <w:pStyle w:val="Compact"/>
             </w:pPr>
             <w:r>
-              <w:t xml:space="preserve">Informants open a tokenised link with no Google account</w:t>
+              <w:t xml:space="preserve">Describes the proving environment, not yours</w:t>
             </w:r>
           </w:p>
         </w:tc>
@@ -301,25 +447,16 @@
               <w:pStyle w:val="Compact"/>
             </w:pPr>
             <w:r>
+              <w:t xml:space="preserve">§7 — you write</w:t>
+            </w:r>
+            <w:r>
+              <w:t xml:space="preserve"> </w:t>
+            </w:r>
+            <w:r>
               <w:rPr>
                 <w:rStyle w:val="VerbatimChar"/>
               </w:rPr>
-              <w:t xml:space="preserve">allow_public_access = false</w:t>
-            </w:r>
-            <w:r>
-              <w:t xml:space="preserve">, plus a load balancer with IAP in front. That removes the</w:t>
-            </w:r>
-            <w:r>
-              <w:t xml:space="preserve"> </w:t>
-            </w:r>
-            <w:r>
-              <w:t xml:space="preserve">“no account, no training”</w:t>
-            </w:r>
-            <w:r>
-              <w:t xml:space="preserve"> </w:t>
-            </w:r>
-            <w:r>
-              <w:t xml:space="preserve">property the interview face was built on. It is a design change, not a flag</w:t>
+              <w:t xml:space="preserve">envs/vmo2.tfvars</w:t>
             </w:r>
           </w:p>
         </w:tc>
@@ -333,10 +470,9 @@
             </w:pPr>
             <w:r>
               <w:rPr>
-                <w:b/>
-                <w:bCs/>
+                <w:rStyle w:val="VerbatimChar"/>
               </w:rPr>
-              <w:t xml:space="preserve">Does the project have its own VPC, or is it on a Shared VPC?</w:t>
+              <w:t xml:space="preserve">node_modules/</w:t>
             </w:r>
           </w:p>
         </w:tc>
@@ -347,7 +483,7 @@
               <w:pStyle w:val="Compact"/>
             </w:pPr>
             <w:r>
-              <w:t xml:space="preserve">Cloud SQL needs private services access</w:t>
+              <w:t xml:space="preserve">495 MB of rebuildable dependencies</w:t>
             </w:r>
           </w:p>
         </w:tc>
@@ -358,7 +494,7 @@
               <w:pStyle w:val="Compact"/>
             </w:pPr>
             <w:r>
-              <w:t xml:space="preserve">Shared VPC: set</w:t>
+              <w:t xml:space="preserve">§2 —</w:t>
             </w:r>
             <w:r>
               <w:t xml:space="preserve"> </w:t>
@@ -367,94 +503,7 @@
               <w:rPr>
                 <w:rStyle w:val="VerbatimChar"/>
               </w:rPr>
-              <w:t xml:space="preserve">network</w:t>
-            </w:r>
-            <w:r>
-              <w:t xml:space="preserve">,</w:t>
-            </w:r>
-            <w:r>
-              <w:t xml:space="preserve"> </w:t>
-            </w:r>
-            <w:r>
-              <w:rPr>
-                <w:rStyle w:val="VerbatimChar"/>
-              </w:rPr>
-              <w:t xml:space="preserve">subnetwork</w:t>
-            </w:r>
-            <w:r>
-              <w:t xml:space="preserve">,</w:t>
-            </w:r>
-            <w:r>
-              <w:t xml:space="preserve"> </w:t>
-            </w:r>
-            <w:r>
-              <w:rPr>
-                <w:rStyle w:val="VerbatimChar"/>
-              </w:rPr>
-              <w:t xml:space="preserve">network_project_id</w:t>
-            </w:r>
-            <w:r>
-              <w:t xml:space="preserve">,</w:t>
-            </w:r>
-            <w:r>
-              <w:t xml:space="preserve"> </w:t>
-            </w:r>
-            <w:r>
-              <w:rPr>
-                <w:rStyle w:val="VerbatimChar"/>
-              </w:rPr>
-              <w:t xml:space="preserve">manage_private_services_access = false</w:t>
-            </w:r>
-            <w:r>
-              <w:t xml:space="preserve"> </w:t>
-            </w:r>
-            <w:r>
-              <w:t xml:space="preserve">—</w:t>
-            </w:r>
-            <w:r>
-              <w:t xml:space="preserve"> </w:t>
-            </w:r>
-            <w:r>
-              <w:rPr>
-                <w:b/>
-                <w:bCs/>
-              </w:rPr>
-              <w:t xml:space="preserve">and they must grant</w:t>
-            </w:r>
-            <w:r>
-              <w:rPr>
-                <w:b/>
-                <w:bCs/>
-              </w:rPr>
-              <w:t xml:space="preserve"> </w:t>
-            </w:r>
-            <w:r>
-              <w:rPr>
-                <w:rStyle w:val="VerbatimChar"/>
-                <w:b/>
-                <w:bCs/>
-              </w:rPr>
-              <w:t xml:space="preserve">roles/compute.networkUser</w:t>
-            </w:r>
-            <w:r>
-              <w:rPr>
-                <w:b/>
-                <w:bCs/>
-              </w:rPr>
-              <w:t xml:space="preserve"> </w:t>
-            </w:r>
-            <w:r>
-              <w:rPr>
-                <w:b/>
-                <w:bCs/>
-              </w:rPr>
-              <w:t xml:space="preserve">on the subnet.</w:t>
-            </w:r>
-            <w:r>
-              <w:t xml:space="preserve"> </w:t>
-            </w:r>
-            <w:r>
-              <w:t xml:space="preserve">Their action, not yours</w:t>
+              <w:t xml:space="preserve">npm ci</w:t>
             </w:r>
           </w:p>
         </w:tc>
@@ -467,11 +516,7 @@
               <w:pStyle w:val="Compact"/>
             </w:pPr>
             <w:r>
-              <w:rPr>
-                <w:b/>
-                <w:bCs/>
-              </w:rPr>
-              <w:t xml:space="preserve">May the deploying identity enable APIs?</w:t>
+              <w:t xml:space="preserve">Terraform state</w:t>
             </w:r>
           </w:p>
         </w:tc>
@@ -482,7 +527,7 @@
               <w:pStyle w:val="Compact"/>
             </w:pPr>
             <w:r>
-              <w:t xml:space="preserve">Terraform enables eleven</w:t>
+              <w:t xml:space="preserve">Lives in a GCS bucket, holds the database password</w:t>
             </w:r>
           </w:p>
         </w:tc>
@@ -493,13 +538,79 @@
               <w:pStyle w:val="Compact"/>
             </w:pPr>
             <w:r>
-              <w:rPr>
-                <w:rStyle w:val="VerbatimChar"/>
-              </w:rPr>
-              <w:t xml:space="preserve">manage_apis = false</w:t>
-            </w:r>
-            <w:r>
-              <w:t xml:space="preserve">, and they enable them centrally first</w:t>
+              <w:t xml:space="preserve">§4.1 — a new bucket in the VMO2 project</w:t>
+            </w:r>
+          </w:p>
+        </w:tc>
+      </w:tr>
+    </w:tbl>
+    <w:p>
+      <w:pPr>
+        <w:pStyle w:val="BodyText"/>
+      </w:pPr>
+      <w:r>
+        <w:t xml:space="preserve">No credential of any kind is in the archive or anywhere in its history. That was</w:t>
+      </w:r>
+      <w:r>
+        <w:t xml:space="preserve"> </w:t>
+      </w:r>
+      <w:r>
+        <w:t xml:space="preserve">checked by scanning every object in the repository, not by inspecting the working</w:t>
+      </w:r>
+      <w:r>
+        <w:t xml:space="preserve"> </w:t>
+      </w:r>
+      <w:r>
+        <w:t xml:space="preserve">tree — a secret removed in a later commit is still in the history, and only the</w:t>
+      </w:r>
+      <w:r>
+        <w:t xml:space="preserve"> </w:t>
+      </w:r>
+      <w:r>
+        <w:t xml:space="preserve">first method finds it.</w:t>
+      </w:r>
+    </w:p>
+    <w:bookmarkEnd w:id="9"/>
+    <w:bookmarkStart w:id="10" w:name="roughly-how-long"/>
+    <w:p>
+      <w:pPr>
+        <w:pStyle w:val="Heading3"/>
+      </w:pPr>
+      <w:r>
+        <w:t xml:space="preserve">Roughly how long</w:t>
+      </w:r>
+    </w:p>
+    <w:tbl>
+      <w:tblPr>
+        <w:tblStyle w:val="Table"/>
+        <w:tblW w:type="pct" w:w="5000"/>
+        <w:tblLayout w:type="fixed"/>
+        <w:tblLook w:firstRow="0" w:lastRow="0" w:firstColumn="0" w:lastColumn="0" w:noHBand="0" w:noVBand="0" w:val="0000"/>
+      </w:tblPr>
+      <w:tblGrid>
+        <w:gridCol w:w="3960"/>
+        <w:gridCol w:w="3960"/>
+      </w:tblGrid>
+      <w:tr>
+        <w:tc>
+          <w:tcPr/>
+          <w:p>
+            <w:pPr>
+              <w:pStyle w:val="Compact"/>
+            </w:pPr>
+            <w:r>
+              <w:t xml:space="preserve">§0 questions to VMO2</w:t>
+            </w:r>
+          </w:p>
+        </w:tc>
+        <w:tc>
+          <w:tcPr/>
+          <w:p>
+            <w:pPr>
+              <w:pStyle w:val="Compact"/>
+            </w:pPr>
+            <w:r>
+              <w:t xml:space="preserve">Ask on day one. Two answers gate everything else</w:t>
             </w:r>
           </w:p>
         </w:tc>
@@ -512,11 +623,7 @@
               <w:pStyle w:val="Compact"/>
             </w:pPr>
             <w:r>
-              <w:rPr>
-                <w:b/>
-                <w:bCs/>
-              </w:rPr>
-              <w:t xml:space="preserve">Are custom IAM roles permitted?</w:t>
+              <w:t xml:space="preserve">§1–3 archive to GitLab</w:t>
             </w:r>
           </w:p>
         </w:tc>
@@ -527,33 +634,7 @@
               <w:pStyle w:val="Compact"/>
             </w:pPr>
             <w:r>
-              <w:t xml:space="preserve">Vertex runs under a custom least-privilege role</w:t>
-            </w:r>
-          </w:p>
-        </w:tc>
-        <w:tc>
-          <w:tcPr/>
-          <w:p>
-            <w:pPr>
-              <w:pStyle w:val="Compact"/>
-            </w:pPr>
-            <w:r>
-              <w:rPr>
-                <w:rStyle w:val="VerbatimChar"/>
-              </w:rPr>
-              <w:t xml:space="preserve">vertex_least_privilege = false</w:t>
-            </w:r>
-            <w:r>
-              <w:t xml:space="preserve">, falling back to</w:t>
-            </w:r>
-            <w:r>
-              <w:t xml:space="preserve"> </w:t>
-            </w:r>
-            <w:r>
-              <w:rPr>
-                <w:rStyle w:val="VerbatimChar"/>
-              </w:rPr>
-              <w:t xml:space="preserve">roles/aiplatform.user</w:t>
+              <w:t xml:space="preserve">Under an hour</w:t>
             </w:r>
           </w:p>
         </w:tc>
@@ -566,11 +647,7 @@
               <w:pStyle w:val="Compact"/>
             </w:pPr>
             <w:r>
-              <w:rPr>
-                <w:b/>
-                <w:bCs/>
-              </w:rPr>
-              <w:t xml:space="preserve">May we enable Anthropic models in Vertex AI Model Garden?</w:t>
+              <w:t xml:space="preserve">§4–7 GCP prerequisites, WIF, variables</w:t>
             </w:r>
           </w:p>
         </w:tc>
@@ -581,27 +658,7 @@
               <w:pStyle w:val="Compact"/>
             </w:pPr>
             <w:r>
-              <w:t xml:space="preserve">It is how the interview model runs without a third-party API key</w:t>
-            </w:r>
-          </w:p>
-        </w:tc>
-        <w:tc>
-          <w:tcPr/>
-          <w:p>
-            <w:pPr>
-              <w:pStyle w:val="Compact"/>
-            </w:pPr>
-            <w:r>
-              <w:t xml:space="preserve">Stay on the direct Anthropic API, which needs a commercial agreement and egress to</w:t>
-            </w:r>
-            <w:r>
-              <w:t xml:space="preserve"> </w:t>
-            </w:r>
-            <w:r>
-              <w:rPr>
-                <w:rStyle w:val="VerbatimChar"/>
-              </w:rPr>
-              <w:t xml:space="preserve">api.anthropic.com</w:t>
+              <w:t xml:space="preserve">Half a day, most of it authentication</w:t>
             </w:r>
           </w:p>
         </w:tc>
@@ -614,40 +671,7 @@
               <w:pStyle w:val="Compact"/>
             </w:pPr>
             <w:r>
-              <w:rPr>
-                <w:b/>
-                <w:bCs/>
-              </w:rPr>
-              <w:t xml:space="preserve">Is</w:t>
-            </w:r>
-            <w:r>
-              <w:rPr>
-                <w:b/>
-                <w:bCs/>
-              </w:rPr>
-              <w:t xml:space="preserve"> </w:t>
-            </w:r>
-            <w:r>
-              <w:rPr>
-                <w:rStyle w:val="VerbatimChar"/>
-                <w:b/>
-                <w:bCs/>
-              </w:rPr>
-              <w:t xml:space="preserve">europe-west1</w:t>
-            </w:r>
-            <w:r>
-              <w:rPr>
-                <w:b/>
-                <w:bCs/>
-              </w:rPr>
-              <w:t xml:space="preserve"> </w:t>
-            </w:r>
-            <w:r>
-              <w:rPr>
-                <w:b/>
-                <w:bCs/>
-              </w:rPr>
-              <w:t xml:space="preserve">acceptable for interview content?</w:t>
+              <w:t xml:space="preserve">§8–10 first pipeline, first deploy</w:t>
             </w:r>
           </w:p>
         </w:tc>
@@ -658,16 +682,20 @@
               <w:pStyle w:val="Compact"/>
             </w:pPr>
             <w:r>
-              <w:rPr>
-                <w:rStyle w:val="VerbatimChar"/>
-              </w:rPr>
-              <w:t xml:space="preserve">europe-west2</w:t>
-            </w:r>
-            <w:r>
-              <w:t xml:space="preserve"> </w:t>
-            </w:r>
-            <w:r>
-              <w:t xml:space="preserve">serves no Anthropic model, so Claude on Vertex means EU rather than UK</w:t>
+              <w:t xml:space="preserve">An hour, plus ~15 min of Cloud SQL</w:t>
+            </w:r>
+          </w:p>
+        </w:tc>
+      </w:tr>
+      <w:tr>
+        <w:tc>
+          <w:tcPr/>
+          <w:p>
+            <w:pPr>
+              <w:pStyle w:val="Compact"/>
+            </w:pPr>
+            <w:r>
+              <w:t xml:space="preserve">§11–13 secrets, accounts, proving it</w:t>
             </w:r>
           </w:p>
         </w:tc>
@@ -678,7 +706,7 @@
               <w:pStyle w:val="Compact"/>
             </w:pPr>
             <w:r>
-              <w:t xml:space="preserve">Either accept EU, or stay on the direct API — which is neither UK nor inside GCP, so it is not the safer option it sounds like</w:t>
+              <w:t xml:space="preserve">An hour</w:t>
             </w:r>
           </w:p>
         </w:tc>
@@ -689,6 +717,581 @@
         <w:pStyle w:val="BodyText"/>
       </w:pPr>
       <w:r>
+        <w:t xml:space="preserve">The elapsed time is dominated by §0, not by the work.</w:t>
+      </w:r>
+    </w:p>
+    <w:p>
+      <w:r>
+        <w:pict>
+          <v:rect style="width:0;height:1.5pt" o:hralign="center" o:hrstd="t" o:hr="t"/>
+        </w:pict>
+      </w:r>
+    </w:p>
+    <w:bookmarkEnd w:id="10"/>
+    <w:bookmarkEnd w:id="11"/>
+    <w:bookmarkStart w:id="12" w:name="what-to-ask-vmo2-first"/>
+    <w:p>
+      <w:pPr>
+        <w:pStyle w:val="Heading2"/>
+      </w:pPr>
+      <w:r>
+        <w:t xml:space="preserve">0 · What to ask VMO2 first</w:t>
+      </w:r>
+    </w:p>
+    <w:p>
+      <w:pPr>
+        <w:pStyle w:val="FirstParagraph"/>
+      </w:pPr>
+      <w:r>
+        <w:t xml:space="preserve">None of this is work. It is five questions, and the answers change the shape of</w:t>
+      </w:r>
+      <w:r>
+        <w:t xml:space="preserve"> </w:t>
+      </w:r>
+      <w:r>
+        <w:t xml:space="preserve">what follows. Ask them all in one message, on the same day you start.</w:t>
+      </w:r>
+    </w:p>
+    <w:tbl>
+      <w:tblPr>
+        <w:tblStyle w:val="Table"/>
+        <w:tblW w:type="pct" w:w="5000"/>
+        <w:tblLayout w:type="fixed"/>
+        <w:tblLook w:firstRow="1" w:lastRow="0" w:firstColumn="0" w:lastColumn="0" w:noHBand="0" w:noVBand="0" w:val="0020"/>
+      </w:tblPr>
+      <w:tblGrid>
+        <w:gridCol w:w="2640"/>
+        <w:gridCol w:w="2640"/>
+        <w:gridCol w:w="2640"/>
+      </w:tblGrid>
+      <w:tr>
+        <w:trPr>
+          <w:tblHeader w:val="on"/>
+        </w:trPr>
+        <w:tc>
+          <w:tcPr/>
+          <w:p>
+            <w:pPr>
+              <w:pStyle w:val="Compact"/>
+            </w:pPr>
+            <w:r>
+              <w:t xml:space="preserve">Question</w:t>
+            </w:r>
+          </w:p>
+        </w:tc>
+        <w:tc>
+          <w:tcPr/>
+          <w:p>
+            <w:pPr>
+              <w:pStyle w:val="Compact"/>
+            </w:pPr>
+            <w:r>
+              <w:t xml:space="preserve">Why it matters</w:t>
+            </w:r>
+          </w:p>
+        </w:tc>
+        <w:tc>
+          <w:tcPr/>
+          <w:p>
+            <w:pPr>
+              <w:pStyle w:val="Compact"/>
+            </w:pPr>
+            <w:r>
+              <w:t xml:space="preserve">If the answer is not the easy one</w:t>
+            </w:r>
+          </w:p>
+        </w:tc>
+      </w:tr>
+      <w:tr>
+        <w:tc>
+          <w:tcPr/>
+          <w:p>
+            <w:pPr>
+              <w:pStyle w:val="Compact"/>
+            </w:pPr>
+            <w:r>
+              <w:rPr>
+                <w:b/>
+                <w:bCs/>
+              </w:rPr>
+              <w:t xml:space="preserve">Will you permit Workload Identity Federation from GitLab to GCP?</w:t>
+            </w:r>
+          </w:p>
+        </w:tc>
+        <w:tc>
+          <w:tcPr/>
+          <w:p>
+            <w:pPr>
+              <w:pStyle w:val="Compact"/>
+            </w:pPr>
+            <w:r>
+              <w:t xml:space="preserve">It is how the pipeline authenticates without a permanent key</w:t>
+            </w:r>
+          </w:p>
+        </w:tc>
+        <w:tc>
+          <w:tcPr/>
+          <w:p>
+            <w:pPr>
+              <w:pStyle w:val="Compact"/>
+            </w:pPr>
+            <w:r>
+              <w:t xml:space="preserve">The fallback is a service account JSON key in a CI variable. Most security teams refuse it. If they do, WIF is not optional and you wait for it</w:t>
+            </w:r>
+          </w:p>
+        </w:tc>
+      </w:tr>
+      <w:tr>
+        <w:tc>
+          <w:tcPr/>
+          <w:p>
+            <w:pPr>
+              <w:pStyle w:val="Compact"/>
+            </w:pPr>
+            <w:r>
+              <w:rPr>
+                <w:b/>
+                <w:bCs/>
+              </w:rPr>
+              <w:t xml:space="preserve">Will you permit an</w:t>
+            </w:r>
+            <w:r>
+              <w:rPr>
+                <w:b/>
+                <w:bCs/>
+              </w:rPr>
+              <w:t xml:space="preserve"> </w:t>
+            </w:r>
+            <w:r>
+              <w:rPr>
+                <w:rStyle w:val="VerbatimChar"/>
+                <w:b/>
+                <w:bCs/>
+              </w:rPr>
+              <w:t xml:space="preserve">allUsers</w:t>
+            </w:r>
+            <w:r>
+              <w:rPr>
+                <w:b/>
+                <w:bCs/>
+              </w:rPr>
+              <w:t xml:space="preserve"> </w:t>
+            </w:r>
+            <w:r>
+              <w:rPr>
+                <w:b/>
+                <w:bCs/>
+              </w:rPr>
+              <w:t xml:space="preserve">invoker binding on Cloud Run?</w:t>
+            </w:r>
+          </w:p>
+        </w:tc>
+        <w:tc>
+          <w:tcPr/>
+          <w:p>
+            <w:pPr>
+              <w:pStyle w:val="Compact"/>
+            </w:pPr>
+            <w:r>
+              <w:t xml:space="preserve">Informants open a tokenised link with no Google account</w:t>
+            </w:r>
+          </w:p>
+        </w:tc>
+        <w:tc>
+          <w:tcPr/>
+          <w:p>
+            <w:pPr>
+              <w:pStyle w:val="Compact"/>
+            </w:pPr>
+            <w:r>
+              <w:rPr>
+                <w:rStyle w:val="VerbatimChar"/>
+              </w:rPr>
+              <w:t xml:space="preserve">allow_public_access = false</w:t>
+            </w:r>
+            <w:r>
+              <w:t xml:space="preserve">, plus a load balancer with IAP in front. That removes the</w:t>
+            </w:r>
+            <w:r>
+              <w:t xml:space="preserve"> </w:t>
+            </w:r>
+            <w:r>
+              <w:t xml:space="preserve">“no account, no training”</w:t>
+            </w:r>
+            <w:r>
+              <w:t xml:space="preserve"> </w:t>
+            </w:r>
+            <w:r>
+              <w:t xml:space="preserve">property the interview face was built on. It is a design change, not a flag</w:t>
+            </w:r>
+          </w:p>
+        </w:tc>
+      </w:tr>
+      <w:tr>
+        <w:tc>
+          <w:tcPr/>
+          <w:p>
+            <w:pPr>
+              <w:pStyle w:val="Compact"/>
+            </w:pPr>
+            <w:r>
+              <w:rPr>
+                <w:b/>
+                <w:bCs/>
+              </w:rPr>
+              <w:t xml:space="preserve">Does the project have its own VPC, or is it on a Shared VPC?</w:t>
+            </w:r>
+          </w:p>
+        </w:tc>
+        <w:tc>
+          <w:tcPr/>
+          <w:p>
+            <w:pPr>
+              <w:pStyle w:val="Compact"/>
+            </w:pPr>
+            <w:r>
+              <w:t xml:space="preserve">Cloud SQL needs private services access</w:t>
+            </w:r>
+          </w:p>
+        </w:tc>
+        <w:tc>
+          <w:tcPr/>
+          <w:p>
+            <w:pPr>
+              <w:pStyle w:val="Compact"/>
+            </w:pPr>
+            <w:r>
+              <w:t xml:space="preserve">Shared VPC: set</w:t>
+            </w:r>
+            <w:r>
+              <w:t xml:space="preserve"> </w:t>
+            </w:r>
+            <w:r>
+              <w:rPr>
+                <w:rStyle w:val="VerbatimChar"/>
+              </w:rPr>
+              <w:t xml:space="preserve">network</w:t>
+            </w:r>
+            <w:r>
+              <w:t xml:space="preserve">,</w:t>
+            </w:r>
+            <w:r>
+              <w:t xml:space="preserve"> </w:t>
+            </w:r>
+            <w:r>
+              <w:rPr>
+                <w:rStyle w:val="VerbatimChar"/>
+              </w:rPr>
+              <w:t xml:space="preserve">subnetwork</w:t>
+            </w:r>
+            <w:r>
+              <w:t xml:space="preserve">,</w:t>
+            </w:r>
+            <w:r>
+              <w:t xml:space="preserve"> </w:t>
+            </w:r>
+            <w:r>
+              <w:rPr>
+                <w:rStyle w:val="VerbatimChar"/>
+              </w:rPr>
+              <w:t xml:space="preserve">network_project_id</w:t>
+            </w:r>
+            <w:r>
+              <w:t xml:space="preserve">,</w:t>
+            </w:r>
+            <w:r>
+              <w:t xml:space="preserve"> </w:t>
+            </w:r>
+            <w:r>
+              <w:rPr>
+                <w:rStyle w:val="VerbatimChar"/>
+              </w:rPr>
+              <w:t xml:space="preserve">manage_private_services_access = false</w:t>
+            </w:r>
+            <w:r>
+              <w:t xml:space="preserve"> </w:t>
+            </w:r>
+            <w:r>
+              <w:t xml:space="preserve">—</w:t>
+            </w:r>
+            <w:r>
+              <w:t xml:space="preserve"> </w:t>
+            </w:r>
+            <w:r>
+              <w:rPr>
+                <w:b/>
+                <w:bCs/>
+              </w:rPr>
+              <w:t xml:space="preserve">and they must grant</w:t>
+            </w:r>
+            <w:r>
+              <w:rPr>
+                <w:b/>
+                <w:bCs/>
+              </w:rPr>
+              <w:t xml:space="preserve"> </w:t>
+            </w:r>
+            <w:r>
+              <w:rPr>
+                <w:rStyle w:val="VerbatimChar"/>
+                <w:b/>
+                <w:bCs/>
+              </w:rPr>
+              <w:t xml:space="preserve">roles/compute.networkUser</w:t>
+            </w:r>
+            <w:r>
+              <w:rPr>
+                <w:b/>
+                <w:bCs/>
+              </w:rPr>
+              <w:t xml:space="preserve"> </w:t>
+            </w:r>
+            <w:r>
+              <w:rPr>
+                <w:b/>
+                <w:bCs/>
+              </w:rPr>
+              <w:t xml:space="preserve">on the subnet.</w:t>
+            </w:r>
+            <w:r>
+              <w:t xml:space="preserve"> </w:t>
+            </w:r>
+            <w:r>
+              <w:t xml:space="preserve">Their action, not yours</w:t>
+            </w:r>
+          </w:p>
+        </w:tc>
+      </w:tr>
+      <w:tr>
+        <w:tc>
+          <w:tcPr/>
+          <w:p>
+            <w:pPr>
+              <w:pStyle w:val="Compact"/>
+            </w:pPr>
+            <w:r>
+              <w:rPr>
+                <w:b/>
+                <w:bCs/>
+              </w:rPr>
+              <w:t xml:space="preserve">May the deploying identity enable APIs?</w:t>
+            </w:r>
+          </w:p>
+        </w:tc>
+        <w:tc>
+          <w:tcPr/>
+          <w:p>
+            <w:pPr>
+              <w:pStyle w:val="Compact"/>
+            </w:pPr>
+            <w:r>
+              <w:t xml:space="preserve">Terraform enables eleven</w:t>
+            </w:r>
+          </w:p>
+        </w:tc>
+        <w:tc>
+          <w:tcPr/>
+          <w:p>
+            <w:pPr>
+              <w:pStyle w:val="Compact"/>
+            </w:pPr>
+            <w:r>
+              <w:rPr>
+                <w:rStyle w:val="VerbatimChar"/>
+              </w:rPr>
+              <w:t xml:space="preserve">manage_apis = false</w:t>
+            </w:r>
+            <w:r>
+              <w:t xml:space="preserve">, and they enable them centrally first</w:t>
+            </w:r>
+          </w:p>
+        </w:tc>
+      </w:tr>
+      <w:tr>
+        <w:tc>
+          <w:tcPr/>
+          <w:p>
+            <w:pPr>
+              <w:pStyle w:val="Compact"/>
+            </w:pPr>
+            <w:r>
+              <w:rPr>
+                <w:b/>
+                <w:bCs/>
+              </w:rPr>
+              <w:t xml:space="preserve">Are custom IAM roles permitted?</w:t>
+            </w:r>
+          </w:p>
+        </w:tc>
+        <w:tc>
+          <w:tcPr/>
+          <w:p>
+            <w:pPr>
+              <w:pStyle w:val="Compact"/>
+            </w:pPr>
+            <w:r>
+              <w:t xml:space="preserve">Vertex runs under a custom least-privilege role</w:t>
+            </w:r>
+          </w:p>
+        </w:tc>
+        <w:tc>
+          <w:tcPr/>
+          <w:p>
+            <w:pPr>
+              <w:pStyle w:val="Compact"/>
+            </w:pPr>
+            <w:r>
+              <w:rPr>
+                <w:rStyle w:val="VerbatimChar"/>
+              </w:rPr>
+              <w:t xml:space="preserve">vertex_least_privilege = false</w:t>
+            </w:r>
+            <w:r>
+              <w:t xml:space="preserve">, falling back to</w:t>
+            </w:r>
+            <w:r>
+              <w:t xml:space="preserve"> </w:t>
+            </w:r>
+            <w:r>
+              <w:rPr>
+                <w:rStyle w:val="VerbatimChar"/>
+              </w:rPr>
+              <w:t xml:space="preserve">roles/aiplatform.user</w:t>
+            </w:r>
+          </w:p>
+        </w:tc>
+      </w:tr>
+      <w:tr>
+        <w:tc>
+          <w:tcPr/>
+          <w:p>
+            <w:pPr>
+              <w:pStyle w:val="Compact"/>
+            </w:pPr>
+            <w:r>
+              <w:rPr>
+                <w:b/>
+                <w:bCs/>
+              </w:rPr>
+              <w:t xml:space="preserve">May we enable Anthropic models in Vertex AI Model Garden?</w:t>
+            </w:r>
+          </w:p>
+        </w:tc>
+        <w:tc>
+          <w:tcPr/>
+          <w:p>
+            <w:pPr>
+              <w:pStyle w:val="Compact"/>
+            </w:pPr>
+            <w:r>
+              <w:t xml:space="preserve">It is how the interview model runs without a third-party API key</w:t>
+            </w:r>
+          </w:p>
+        </w:tc>
+        <w:tc>
+          <w:tcPr/>
+          <w:p>
+            <w:pPr>
+              <w:pStyle w:val="Compact"/>
+            </w:pPr>
+            <w:r>
+              <w:t xml:space="preserve">Stay on the direct Anthropic API, which needs a commercial agreement and egress to</w:t>
+            </w:r>
+            <w:r>
+              <w:t xml:space="preserve"> </w:t>
+            </w:r>
+            <w:r>
+              <w:rPr>
+                <w:rStyle w:val="VerbatimChar"/>
+              </w:rPr>
+              <w:t xml:space="preserve">api.anthropic.com</w:t>
+            </w:r>
+          </w:p>
+        </w:tc>
+      </w:tr>
+      <w:tr>
+        <w:tc>
+          <w:tcPr/>
+          <w:p>
+            <w:pPr>
+              <w:pStyle w:val="Compact"/>
+            </w:pPr>
+            <w:r>
+              <w:rPr>
+                <w:b/>
+                <w:bCs/>
+              </w:rPr>
+              <w:t xml:space="preserve">Is</w:t>
+            </w:r>
+            <w:r>
+              <w:rPr>
+                <w:b/>
+                <w:bCs/>
+              </w:rPr>
+              <w:t xml:space="preserve"> </w:t>
+            </w:r>
+            <w:r>
+              <w:rPr>
+                <w:rStyle w:val="VerbatimChar"/>
+                <w:b/>
+                <w:bCs/>
+              </w:rPr>
+              <w:t xml:space="preserve">europe-west1</w:t>
+            </w:r>
+            <w:r>
+              <w:rPr>
+                <w:b/>
+                <w:bCs/>
+              </w:rPr>
+              <w:t xml:space="preserve"> </w:t>
+            </w:r>
+            <w:r>
+              <w:rPr>
+                <w:b/>
+                <w:bCs/>
+              </w:rPr>
+              <w:t xml:space="preserve">acceptable for interview content?</w:t>
+            </w:r>
+          </w:p>
+        </w:tc>
+        <w:tc>
+          <w:tcPr/>
+          <w:p>
+            <w:pPr>
+              <w:pStyle w:val="Compact"/>
+            </w:pPr>
+            <w:r>
+              <w:rPr>
+                <w:rStyle w:val="VerbatimChar"/>
+              </w:rPr>
+              <w:t xml:space="preserve">europe-west2</w:t>
+            </w:r>
+            <w:r>
+              <w:t xml:space="preserve"> </w:t>
+            </w:r>
+            <w:r>
+              <w:t xml:space="preserve">serves no Anthropic model, so Claude on Vertex means EU rather than UK</w:t>
+            </w:r>
+          </w:p>
+        </w:tc>
+        <w:tc>
+          <w:tcPr/>
+          <w:p>
+            <w:pPr>
+              <w:pStyle w:val="Compact"/>
+            </w:pPr>
+            <w:r>
+              <w:t xml:space="preserve">Either accept EU, or stay on the direct API — which is neither UK nor inside GCP, so it is not the safer option it sounds like</w:t>
+            </w:r>
+          </w:p>
+        </w:tc>
+      </w:tr>
+    </w:tbl>
+    <w:p>
+      <w:pPr>
+        <w:pStyle w:val="BodyText"/>
+      </w:pPr>
+      <w:r>
         <w:t xml:space="preserve">Also settle two things internally:</w:t>
       </w:r>
     </w:p>
@@ -795,8 +1398,8 @@
         </w:pict>
       </w:r>
     </w:p>
-    <w:bookmarkEnd w:id="9"/>
-    <w:bookmarkStart w:id="14" w:name="make-the-archive"/>
+    <w:bookmarkEnd w:id="12"/>
+    <w:bookmarkStart w:id="17" w:name="make-the-archive"/>
     <w:p>
       <w:pPr>
         <w:pStyle w:val="Heading2"/>
@@ -813,7 +1416,7 @@
         <w:t xml:space="preserve">On your personal machine, in the project folder.</w:t>
       </w:r>
     </w:p>
-    <w:bookmarkStart w:id="10" w:name="what-must-not-travel"/>
+    <w:bookmarkStart w:id="13" w:name="what-must-not-travel"/>
     <w:p>
       <w:pPr>
         <w:pStyle w:val="Heading3"/>
@@ -1012,8 +1615,8 @@
         <w:t xml:space="preserve">That is the argument for the command below over anything that copies a folder.</w:t>
       </w:r>
     </w:p>
-    <w:bookmarkEnd w:id="10"/>
-    <w:bookmarkStart w:id="11" w:name="the-command"/>
+    <w:bookmarkEnd w:id="13"/>
+    <w:bookmarkStart w:id="14" w:name="the-command"/>
     <w:p>
       <w:pPr>
         <w:pStyle w:val="Heading3"/>
@@ -1068,8 +1671,8 @@
         <w:t xml:space="preserve">One file, about 34 MB, containing the full history and nothing else.</w:t>
       </w:r>
     </w:p>
-    <w:bookmarkEnd w:id="11"/>
-    <w:bookmarkStart w:id="12" w:name="why-a-bundle-and-not-a-zip"/>
+    <w:bookmarkEnd w:id="14"/>
+    <w:bookmarkStart w:id="15" w:name="why-a-bundle-and-not-a-zip"/>
     <w:p>
       <w:pPr>
         <w:pStyle w:val="Heading3"/>
@@ -1249,8 +1852,8 @@
         <w:t xml:space="preserve">rather not carry commits across.</w:t>
       </w:r>
     </w:p>
-    <w:bookmarkEnd w:id="12"/>
-    <w:bookmarkStart w:id="13" w:name="verify-it-before-it-leaves-the-machine"/>
+    <w:bookmarkEnd w:id="15"/>
+    <w:bookmarkStart w:id="16" w:name="verify-it-before-it-leaves-the-machine"/>
     <w:p>
       <w:pPr>
         <w:pStyle w:val="Heading3"/>
@@ -1954,9 +2557,9 @@
         </w:pict>
       </w:r>
     </w:p>
-    <w:bookmarkEnd w:id="13"/>
-    <w:bookmarkEnd w:id="14"/>
-    <w:bookmarkStart w:id="15" w:name="on-the-official-machine"/>
+    <w:bookmarkEnd w:id="16"/>
+    <w:bookmarkEnd w:id="17"/>
+    <w:bookmarkStart w:id="18" w:name="on-the-official-machine"/>
     <w:p>
       <w:pPr>
         <w:pStyle w:val="Heading2"/>
@@ -2183,8 +2786,8 @@
         </w:pict>
       </w:r>
     </w:p>
-    <w:bookmarkEnd w:id="15"/>
-    <w:bookmarkStart w:id="16" w:name="create-the-gitlab-project-and-push"/>
+    <w:bookmarkEnd w:id="18"/>
+    <w:bookmarkStart w:id="19" w:name="create-the-gitlab-project-and-push"/>
     <w:p>
       <w:pPr>
         <w:pStyle w:val="Heading2"/>
@@ -2562,8 +3165,8 @@
         </w:pict>
       </w:r>
     </w:p>
-    <w:bookmarkEnd w:id="16"/>
-    <w:bookmarkStart w:id="19" w:name="gcp-prerequisites"/>
+    <w:bookmarkEnd w:id="19"/>
+    <w:bookmarkStart w:id="22" w:name="gcp-prerequisites"/>
     <w:p>
       <w:pPr>
         <w:pStyle w:val="Heading2"/>
@@ -2731,7 +3334,7 @@
         <w:t xml:space="preserve">$PROJECT</w:t>
       </w:r>
     </w:p>
-    <w:bookmarkStart w:id="17" w:name="state-bucket"/>
+    <w:bookmarkStart w:id="20" w:name="state-bucket"/>
     <w:p>
       <w:pPr>
         <w:pStyle w:val="Heading3"/>
@@ -2846,8 +3449,8 @@
         <w:t xml:space="preserve">command.</w:t>
       </w:r>
     </w:p>
-    <w:bookmarkEnd w:id="17"/>
-    <w:bookmarkStart w:id="18" w:name="the-deploy-identity"/>
+    <w:bookmarkEnd w:id="20"/>
+    <w:bookmarkStart w:id="21" w:name="the-deploy-identity"/>
     <w:p>
       <w:pPr>
         <w:pStyle w:val="Heading3"/>
@@ -3326,9 +3929,9 @@
         </w:pict>
       </w:r>
     </w:p>
-    <w:bookmarkEnd w:id="18"/>
-    <w:bookmarkEnd w:id="19"/>
-    <w:bookmarkStart w:id="23" w:name="workload-identity-federation"/>
+    <w:bookmarkEnd w:id="21"/>
+    <w:bookmarkEnd w:id="22"/>
+    <w:bookmarkStart w:id="26" w:name="workload-identity-federation"/>
     <w:p>
       <w:pPr>
         <w:pStyle w:val="Heading2"/>
@@ -3351,7 +3954,7 @@
         <w:t xml:space="preserve">to 5.3.</w:t>
       </w:r>
     </w:p>
-    <w:bookmarkStart w:id="20" w:name="pool-and-provider"/>
+    <w:bookmarkStart w:id="23" w:name="pool-and-provider"/>
     <w:p>
       <w:pPr>
         <w:pStyle w:val="Heading3"/>
@@ -3731,8 +4334,8 @@
         <w:t xml:space="preserve">that GitLab instance can assume this identity. Do not omit it, and make it exact.</w:t>
       </w:r>
     </w:p>
-    <w:bookmarkEnd w:id="20"/>
-    <w:bookmarkStart w:id="21" w:name="X973b2907279bbe0c6dc72ccc7a6646f2544cd55"/>
+    <w:bookmarkEnd w:id="23"/>
+    <w:bookmarkStart w:id="24" w:name="X973b2907279bbe0c6dc72ccc7a6646f2544cd55"/>
     <w:p>
       <w:pPr>
         <w:pStyle w:val="Heading3"/>
@@ -3955,8 +4558,8 @@
         <w:t xml:space="preserve">so only the default branch may deploy.</w:t>
       </w:r>
     </w:p>
-    <w:bookmarkEnd w:id="21"/>
-    <w:bookmarkStart w:id="22" w:name="if-wif-was-refused"/>
+    <w:bookmarkEnd w:id="24"/>
+    <w:bookmarkStart w:id="25" w:name="if-wif-was-refused"/>
     <w:p>
       <w:pPr>
         <w:pStyle w:val="Heading3"/>
@@ -4104,9 +4707,9 @@
         </w:pict>
       </w:r>
     </w:p>
-    <w:bookmarkEnd w:id="22"/>
-    <w:bookmarkEnd w:id="23"/>
-    <w:bookmarkStart w:id="24" w:name="gitlab-cicd-variables"/>
+    <w:bookmarkEnd w:id="25"/>
+    <w:bookmarkEnd w:id="26"/>
+    <w:bookmarkStart w:id="27" w:name="gitlab-cicd-variables"/>
     <w:p>
       <w:pPr>
         <w:pStyle w:val="Heading2"/>
@@ -4517,8 +5120,8 @@
         </w:pict>
       </w:r>
     </w:p>
-    <w:bookmarkEnd w:id="24"/>
-    <w:bookmarkStart w:id="25" w:name="the-environment-file"/>
+    <w:bookmarkEnd w:id="27"/>
+    <w:bookmarkStart w:id="28" w:name="the-environment-file"/>
     <w:p>
       <w:pPr>
         <w:pStyle w:val="Heading2"/>
@@ -4908,8 +5511,8 @@
         </w:pict>
       </w:r>
     </w:p>
-    <w:bookmarkEnd w:id="25"/>
-    <w:bookmarkStart w:id="26" w:name="first-pipeline-run-verify-only"/>
+    <w:bookmarkEnd w:id="28"/>
+    <w:bookmarkStart w:id="29" w:name="first-pipeline-run-verify-only"/>
     <w:p>
       <w:pPr>
         <w:pStyle w:val="Heading2"/>
@@ -5037,8 +5640,8 @@
         </w:pict>
       </w:r>
     </w:p>
-    <w:bookmarkEnd w:id="26"/>
-    <w:bookmarkStart w:id="27" w:name="the-registry-once-by-hand"/>
+    <w:bookmarkEnd w:id="29"/>
+    <w:bookmarkStart w:id="30" w:name="the-registry-once-by-hand"/>
     <w:p>
       <w:pPr>
         <w:pStyle w:val="Heading2"/>
@@ -5529,8 +6132,8 @@
         </w:pict>
       </w:r>
     </w:p>
-    <w:bookmarkEnd w:id="27"/>
-    <w:bookmarkStart w:id="28" w:name="first-deployment"/>
+    <w:bookmarkEnd w:id="30"/>
+    <w:bookmarkStart w:id="31" w:name="first-deployment"/>
     <w:p>
       <w:pPr>
         <w:pStyle w:val="Heading2"/>
@@ -5730,8 +6333,8 @@
         </w:pict>
       </w:r>
     </w:p>
-    <w:bookmarkEnd w:id="28"/>
-    <w:bookmarkStart w:id="30" w:name="the-two-secrets-terraform-never-holds"/>
+    <w:bookmarkEnd w:id="31"/>
+    <w:bookmarkStart w:id="33" w:name="the-two-secrets-terraform-never-holds"/>
     <w:p>
       <w:pPr>
         <w:pStyle w:val="Heading2"/>
@@ -6046,7 +6649,7 @@
         </w:pict>
       </w:r>
     </w:p>
-    <w:bookmarkStart w:id="29" w:name="choosing-where-the-interview-model-runs"/>
+    <w:bookmarkStart w:id="32" w:name="choosing-where-the-interview-model-runs"/>
     <w:p>
       <w:pPr>
         <w:pStyle w:val="Heading3"/>
@@ -6541,9 +7144,9 @@
         <w:t xml:space="preserve">Rolling back is the same three lines in reverse, plus putting the key back.</w:t>
       </w:r>
     </w:p>
-    <w:bookmarkEnd w:id="29"/>
-    <w:bookmarkEnd w:id="30"/>
-    <w:bookmarkStart w:id="31" w:name="console-accounts"/>
+    <w:bookmarkEnd w:id="32"/>
+    <w:bookmarkEnd w:id="33"/>
+    <w:bookmarkStart w:id="34" w:name="console-accounts"/>
     <w:p>
       <w:pPr>
         <w:pStyle w:val="Heading2"/>
@@ -6793,8 +7396,8 @@
         </w:pict>
       </w:r>
     </w:p>
-    <w:bookmarkEnd w:id="31"/>
-    <w:bookmarkStart w:id="32" w:name="prove-it-works"/>
+    <w:bookmarkEnd w:id="34"/>
+    <w:bookmarkStart w:id="35" w:name="prove-it-works"/>
     <w:p>
       <w:pPr>
         <w:pStyle w:val="Heading2"/>
@@ -7562,8 +8165,8 @@
         </w:pict>
       </w:r>
     </w:p>
-    <w:bookmarkEnd w:id="32"/>
-    <w:bookmarkStart w:id="33" w:name="running-the-pilot"/>
+    <w:bookmarkEnd w:id="35"/>
+    <w:bookmarkStart w:id="36" w:name="running-the-pilot"/>
     <w:p>
       <w:pPr>
         <w:pStyle w:val="Heading2"/>
@@ -7703,8 +8306,8 @@
         </w:pict>
       </w:r>
     </w:p>
-    <w:bookmarkEnd w:id="33"/>
-    <w:bookmarkStart w:id="35" w:name="when-something-goes-wrong"/>
+    <w:bookmarkEnd w:id="36"/>
+    <w:bookmarkStart w:id="38" w:name="when-something-goes-wrong"/>
     <w:p>
       <w:pPr>
         <w:pStyle w:val="Heading2"/>
@@ -8341,7 +8944,7 @@
         </w:tc>
       </w:tr>
     </w:tbl>
-    <w:bookmarkStart w:id="34" w:name="rolling-back-a-bad-deployment"/>
+    <w:bookmarkStart w:id="37" w:name="rolling-back-a-bad-deployment"/>
     <w:p>
       <w:pPr>
         <w:pStyle w:val="Heading3"/>
@@ -8465,9 +9068,9 @@
         </w:pict>
       </w:r>
     </w:p>
-    <w:bookmarkEnd w:id="34"/>
-    <w:bookmarkEnd w:id="35"/>
-    <w:bookmarkStart w:id="36" w:name="what-is-not-proven"/>
+    <w:bookmarkEnd w:id="37"/>
+    <w:bookmarkEnd w:id="38"/>
+    <w:bookmarkStart w:id="39" w:name="what-is-not-proven"/>
     <w:p>
       <w:pPr>
         <w:pStyle w:val="Heading2"/>
@@ -8673,8 +9276,8 @@
         </w:pict>
       </w:r>
     </w:p>
-    <w:bookmarkEnd w:id="36"/>
-    <w:bookmarkStart w:id="37" w:name="appendix-a-what-the-pipeline-does"/>
+    <w:bookmarkEnd w:id="39"/>
+    <w:bookmarkStart w:id="40" w:name="appendix-a-what-the-pipeline-does"/>
     <w:p>
       <w:pPr>
         <w:pStyle w:val="Heading2"/>
@@ -9081,8 +9684,8 @@
         <w:t xml:space="preserve">.</w:t>
       </w:r>
     </w:p>
-    <w:bookmarkEnd w:id="37"/>
-    <w:bookmarkStart w:id="38" w:name="X0ffe2a46fc550a97dc584cef00ec71608a25ca2"/>
+    <w:bookmarkEnd w:id="40"/>
+    <w:bookmarkStart w:id="41" w:name="X0ffe2a46fc550a97dc584cef00ec71608a25ca2"/>
     <w:p>
       <w:pPr>
         <w:pStyle w:val="Heading2"/>
@@ -9575,8 +10178,8 @@
         </w:tc>
       </w:tr>
     </w:tbl>
-    <w:bookmarkEnd w:id="38"/>
-    <w:bookmarkEnd w:id="39"/>
+    <w:bookmarkEnd w:id="41"/>
+    <w:bookmarkEnd w:id="42"/>
     <w:sectPr>
       <w:pgSz w:h="15840" w:w="12240"/>
       <w:pgMar w:bottom="907" w:footer="720" w:gutter="0" w:header="720" w:left="1134" w:right="1134" w:top="1020"/>

</xml_diff>